<commit_message>
sort folder, produce GIF for B
</commit_message>
<xml_diff>
--- a/report.docx
+++ b/report.docx
@@ -804,7 +804,7 @@
               <w:pStyle w:val="aa"/>
               <w:ind w:left="0"/>
               <w:rPr>
-                <w:rFonts w:ascii="Times New Roman" w:eastAsia="標楷體" w:hAnsi="Times New Roman" w:cs="Times New Roman" w:hint="eastAsia"/>
+                <w:rFonts w:ascii="Times New Roman" w:eastAsia="標楷體" w:hAnsi="Times New Roman" w:cs="Times New Roman"/>
                 <w:noProof/>
               </w:rPr>
             </w:pPr>
@@ -998,7 +998,7 @@
               <w:pStyle w:val="aa"/>
               <w:ind w:left="0"/>
               <w:rPr>
-                <w:rFonts w:ascii="Times New Roman" w:eastAsia="標楷體" w:hAnsi="Times New Roman" w:cs="Times New Roman" w:hint="eastAsia"/>
+                <w:rFonts w:ascii="Times New Roman" w:eastAsia="標楷體" w:hAnsi="Times New Roman" w:cs="Times New Roman"/>
                 <w:noProof/>
               </w:rPr>
             </w:pPr>
@@ -1496,15 +1496,76 @@
       <w:r>
         <w:rPr>
           <w:rFonts w:ascii="Times New Roman" w:eastAsia="標楷體" w:hAnsi="Times New Roman" w:cs="Times New Roman"/>
+          <w:noProof/>
+        </w:rPr>
+        <w:lastRenderedPageBreak/>
+        <w:drawing>
+          <wp:anchor distT="0" distB="0" distL="114300" distR="114300" simplePos="0" relativeHeight="251673600" behindDoc="0" locked="0" layoutInCell="1" allowOverlap="1" wp14:anchorId="3E5F32E5" wp14:editId="61EC8F0D">
+            <wp:simplePos x="0" y="0"/>
+            <wp:positionH relativeFrom="margin">
+              <wp:align>center</wp:align>
+            </wp:positionH>
+            <wp:positionV relativeFrom="paragraph">
+              <wp:posOffset>28</wp:posOffset>
+            </wp:positionV>
+            <wp:extent cx="4599940" cy="1268095"/>
+            <wp:effectExtent l="0" t="0" r="0" b="8255"/>
+            <wp:wrapSquare wrapText="bothSides"/>
+            <wp:docPr id="926164691" name="圖片 8"/>
+            <wp:cNvGraphicFramePr>
+              <a:graphicFrameLocks xmlns:a="http://schemas.openxmlformats.org/drawingml/2006/main" noChangeAspect="1"/>
+            </wp:cNvGraphicFramePr>
+            <a:graphic xmlns:a="http://schemas.openxmlformats.org/drawingml/2006/main">
+              <a:graphicData uri="http://schemas.openxmlformats.org/drawingml/2006/picture">
+                <pic:pic xmlns:pic="http://schemas.openxmlformats.org/drawingml/2006/picture">
+                  <pic:nvPicPr>
+                    <pic:cNvPr id="926164691" name="圖片 8"/>
+                    <pic:cNvPicPr>
+                      <a:picLocks noChangeAspect="1" noChangeArrowheads="1"/>
+                    </pic:cNvPicPr>
+                  </pic:nvPicPr>
+                  <pic:blipFill>
+                    <a:blip r:embed="rId7">
+                      <a:extLst>
+                        <a:ext uri="{28A0092B-C50C-407E-A947-70E740481C1C}">
+                          <a14:useLocalDpi xmlns:a14="http://schemas.microsoft.com/office/drawing/2010/main" val="0"/>
+                        </a:ext>
+                      </a:extLst>
+                    </a:blip>
+                    <a:stretch>
+                      <a:fillRect/>
+                    </a:stretch>
+                  </pic:blipFill>
+                  <pic:spPr bwMode="auto">
+                    <a:xfrm>
+                      <a:off x="0" y="0"/>
+                      <a:ext cx="4599940" cy="1268239"/>
+                    </a:xfrm>
+                    <a:prstGeom prst="rect">
+                      <a:avLst/>
+                    </a:prstGeom>
+                    <a:noFill/>
+                    <a:ln>
+                      <a:noFill/>
+                    </a:ln>
+                  </pic:spPr>
+                </pic:pic>
+              </a:graphicData>
+            </a:graphic>
+          </wp:anchor>
+        </w:drawing>
+      </w:r>
+      <w:r>
+        <w:rPr>
+          <w:rFonts w:ascii="Times New Roman" w:eastAsia="標楷體" w:hAnsi="Times New Roman" w:cs="Times New Roman"/>
           <w:b/>
           <w:bCs/>
           <w:noProof/>
         </w:rPr>
-        <w:lastRenderedPageBreak/>
         <mc:AlternateContent>
           <mc:Choice Requires="wps">
             <w:drawing>
-              <wp:anchor distT="0" distB="0" distL="114300" distR="114300" simplePos="0" relativeHeight="251661312" behindDoc="0" locked="0" layoutInCell="1" allowOverlap="1" wp14:anchorId="2DD3BB30" wp14:editId="73FB3D42">
+              <wp:anchor distT="0" distB="0" distL="114300" distR="114300" simplePos="0" relativeHeight="251661312" behindDoc="0" locked="0" layoutInCell="1" allowOverlap="1" wp14:anchorId="2DD3BB30" wp14:editId="41324EE0">
                 <wp:simplePos x="0" y="0"/>
                 <wp:positionH relativeFrom="margin">
                   <wp:align>right</wp:align>
@@ -1685,68 +1746,6 @@
           </mc:Fallback>
         </mc:AlternateContent>
       </w:r>
-      <w:r>
-        <w:rPr>
-          <w:rFonts w:ascii="Times New Roman" w:eastAsia="標楷體" w:hAnsi="Times New Roman" w:cs="Times New Roman"/>
-          <w:noProof/>
-        </w:rPr>
-        <w:drawing>
-          <wp:anchor distT="0" distB="0" distL="114300" distR="114300" simplePos="0" relativeHeight="251673600" behindDoc="0" locked="0" layoutInCell="1" allowOverlap="1" wp14:anchorId="3E5F32E5" wp14:editId="74429259">
-            <wp:simplePos x="0" y="0"/>
-            <wp:positionH relativeFrom="margin">
-              <wp:align>center</wp:align>
-            </wp:positionH>
-            <wp:positionV relativeFrom="paragraph">
-              <wp:posOffset>28</wp:posOffset>
-            </wp:positionV>
-            <wp:extent cx="4599940" cy="1268730"/>
-            <wp:effectExtent l="0" t="0" r="0" b="7620"/>
-            <wp:wrapSquare wrapText="bothSides"/>
-            <wp:docPr id="926164691" name="圖片 8"/>
-            <wp:cNvGraphicFramePr>
-              <a:graphicFrameLocks xmlns:a="http://schemas.openxmlformats.org/drawingml/2006/main" noChangeAspect="1"/>
-            </wp:cNvGraphicFramePr>
-            <a:graphic xmlns:a="http://schemas.openxmlformats.org/drawingml/2006/main">
-              <a:graphicData uri="http://schemas.openxmlformats.org/drawingml/2006/picture">
-                <pic:pic xmlns:pic="http://schemas.openxmlformats.org/drawingml/2006/picture">
-                  <pic:nvPicPr>
-                    <pic:cNvPr id="0" name="Picture 3"/>
-                    <pic:cNvPicPr>
-                      <a:picLocks noChangeAspect="1" noChangeArrowheads="1"/>
-                    </pic:cNvPicPr>
-                  </pic:nvPicPr>
-                  <pic:blipFill>
-                    <a:blip r:embed="rId7" cstate="print">
-                      <a:extLst>
-                        <a:ext uri="{28A0092B-C50C-407E-A947-70E740481C1C}">
-                          <a14:useLocalDpi xmlns:a14="http://schemas.microsoft.com/office/drawing/2010/main" val="0"/>
-                        </a:ext>
-                      </a:extLst>
-                    </a:blip>
-                    <a:srcRect/>
-                    <a:stretch>
-                      <a:fillRect/>
-                    </a:stretch>
-                  </pic:blipFill>
-                  <pic:spPr bwMode="auto">
-                    <a:xfrm>
-                      <a:off x="0" y="0"/>
-                      <a:ext cx="4599940" cy="1268730"/>
-                    </a:xfrm>
-                    <a:prstGeom prst="rect">
-                      <a:avLst/>
-                    </a:prstGeom>
-                    <a:noFill/>
-                    <a:ln>
-                      <a:noFill/>
-                    </a:ln>
-                  </pic:spPr>
-                </pic:pic>
-              </a:graphicData>
-            </a:graphic>
-          </wp:anchor>
-        </w:drawing>
-      </w:r>
     </w:p>
     <w:p>
       <w:pPr>
@@ -2025,7 +2024,7 @@
           <w:noProof/>
         </w:rPr>
         <w:drawing>
-          <wp:anchor distT="0" distB="0" distL="114300" distR="114300" simplePos="0" relativeHeight="251674624" behindDoc="0" locked="0" layoutInCell="1" allowOverlap="1" wp14:anchorId="5943DF4A" wp14:editId="3EAD47AC">
+          <wp:anchor distT="0" distB="0" distL="114300" distR="114300" simplePos="0" relativeHeight="251674624" behindDoc="0" locked="0" layoutInCell="1" allowOverlap="1" wp14:anchorId="5943DF4A" wp14:editId="6FA83E46">
             <wp:simplePos x="0" y="0"/>
             <wp:positionH relativeFrom="margin">
               <wp:align>center</wp:align>
@@ -2509,8 +2508,17 @@
                                 <w:rFonts w:ascii="Times New Roman" w:hAnsi="Times New Roman" w:cs="Times New Roman"/>
                                 <w:color w:val="000000" w:themeColor="text1"/>
                               </w:rPr>
-                              <w:t>▲target network update per 5 episode</w:t>
+                              <w:t xml:space="preserve">▲target network update per 5 </w:t>
                             </w:r>
+                            <w:proofErr w:type="gramStart"/>
+                            <w:r>
+                              <w:rPr>
+                                <w:rFonts w:ascii="Times New Roman" w:hAnsi="Times New Roman" w:cs="Times New Roman"/>
+                                <w:color w:val="000000" w:themeColor="text1"/>
+                              </w:rPr>
+                              <w:t>episode</w:t>
+                            </w:r>
+                            <w:proofErr w:type="gramEnd"/>
                           </w:p>
                         </w:txbxContent>
                       </wps:txbx>
@@ -2550,8 +2558,17 @@
                           <w:rFonts w:ascii="Times New Roman" w:hAnsi="Times New Roman" w:cs="Times New Roman"/>
                           <w:color w:val="000000" w:themeColor="text1"/>
                         </w:rPr>
-                        <w:t>▲target network update per 5 episode</w:t>
+                        <w:t xml:space="preserve">▲target network update per 5 </w:t>
                       </w:r>
+                      <w:proofErr w:type="gramStart"/>
+                      <w:r>
+                        <w:rPr>
+                          <w:rFonts w:ascii="Times New Roman" w:hAnsi="Times New Roman" w:cs="Times New Roman"/>
+                          <w:color w:val="000000" w:themeColor="text1"/>
+                        </w:rPr>
+                        <w:t>episode</w:t>
+                      </w:r>
+                      <w:proofErr w:type="gramEnd"/>
                     </w:p>
                   </w:txbxContent>
                 </v:textbox>
@@ -2622,8 +2639,17 @@
                                 <w:rFonts w:ascii="Times New Roman" w:hAnsi="Times New Roman" w:cs="Times New Roman" w:hint="eastAsia"/>
                                 <w:color w:val="000000" w:themeColor="text1"/>
                               </w:rPr>
-                              <w:t>per 20 episode</w:t>
+                              <w:t xml:space="preserve">per 20 </w:t>
                             </w:r>
+                            <w:proofErr w:type="gramStart"/>
+                            <w:r>
+                              <w:rPr>
+                                <w:rFonts w:ascii="Times New Roman" w:hAnsi="Times New Roman" w:cs="Times New Roman" w:hint="eastAsia"/>
+                                <w:color w:val="000000" w:themeColor="text1"/>
+                              </w:rPr>
+                              <w:t>episode</w:t>
+                            </w:r>
+                            <w:proofErr w:type="gramEnd"/>
                           </w:p>
                         </w:txbxContent>
                       </wps:txbx>
@@ -2669,8 +2695,17 @@
                           <w:rFonts w:ascii="Times New Roman" w:hAnsi="Times New Roman" w:cs="Times New Roman" w:hint="eastAsia"/>
                           <w:color w:val="000000" w:themeColor="text1"/>
                         </w:rPr>
-                        <w:t>per 20 episode</w:t>
+                        <w:t xml:space="preserve">per 20 </w:t>
                       </w:r>
+                      <w:proofErr w:type="gramStart"/>
+                      <w:r>
+                        <w:rPr>
+                          <w:rFonts w:ascii="Times New Roman" w:hAnsi="Times New Roman" w:cs="Times New Roman" w:hint="eastAsia"/>
+                          <w:color w:val="000000" w:themeColor="text1"/>
+                        </w:rPr>
+                        <w:t>episode</w:t>
+                      </w:r>
+                      <w:proofErr w:type="gramEnd"/>
                     </w:p>
                   </w:txbxContent>
                 </v:textbox>
@@ -2870,7 +2905,25 @@
           <w:b/>
           <w:bCs/>
         </w:rPr>
-        <w:t>實驗三：測試</w:t>
+        <w:t>實驗</w:t>
+      </w:r>
+      <w:proofErr w:type="gramStart"/>
+      <w:r>
+        <w:rPr>
+          <w:rFonts w:ascii="Times New Roman" w:eastAsia="標楷體" w:hAnsi="Times New Roman" w:cs="Times New Roman"/>
+          <w:b/>
+          <w:bCs/>
+        </w:rPr>
+        <w:t>三</w:t>
+      </w:r>
+      <w:proofErr w:type="gramEnd"/>
+      <w:r>
+        <w:rPr>
+          <w:rFonts w:ascii="Times New Roman" w:eastAsia="標楷體" w:hAnsi="Times New Roman" w:cs="Times New Roman"/>
+          <w:b/>
+          <w:bCs/>
+        </w:rPr>
+        <w:t>：測試</w:t>
       </w:r>
       <w:r>
         <w:rPr>

</xml_diff>